<commit_message>
fe-cell-integration: pin all cell URLs to dtx.innbucks.co.<iso>
Standardise every per-cell base URL example to the
https://dtx.innbucks.co.<iso> pattern (KE example was an out-of-pattern
api-ke.innbucks.com placeholder). Add a "URL convention" row to the
quick-reference table so future cells follow the same shape.

https://claude.ai/code/session_01M61kYRWKgsADqZj6J8v48s
</commit_message>
<xml_diff>
--- a/docs/fe-cell-integration.docx
+++ b/docs/fe-cell-integration.docx
@@ -156,7 +156,7 @@
           </w:tcPr>
           <w:p>
             <w:r>
-              <w:t>https://api-ke.innbucks.com (example)</w:t>
+              <w:t>https://dtx.innbucks.co.ke</w:t>
             </w:r>
           </w:p>
         </w:tc>
@@ -294,7 +294,7 @@
         <w:br/>
         <w:t xml:space="preserve">    "homeCountry": "KE",</w:t>
         <w:br/>
-        <w:t xml:space="preserve">    "homeBaseUrl": "https://api-ke.innbucks.com"</w:t>
+        <w:t xml:space="preserve">    "homeBaseUrl": "https://dtx.innbucks.co.ke"</w:t>
         <w:br/>
         <w:t xml:space="preserve">  }</w:t>
         <w:br/>
@@ -441,7 +441,7 @@
         <w:br/>
         <w:t xml:space="preserve">    "homeCountry": "KE",</w:t>
         <w:br/>
-        <w:t xml:space="preserve">    "homeBaseUrl": "https://api-ke.innbucks.com"</w:t>
+        <w:t xml:space="preserve">    "homeBaseUrl": "https://dtx.innbucks.co.ke"</w:t>
         <w:br/>
         <w:t xml:space="preserve">  }</w:t>
         <w:br/>
@@ -779,6 +779,28 @@
           </w:p>
         </w:tc>
       </w:tr>
+      <w:tr>
+        <w:tc>
+          <w:tcPr>
+            <w:tcW w:type="dxa" w:w="4320"/>
+          </w:tcPr>
+          <w:p>
+            <w:r>
+              <w:t>URL convention</w:t>
+            </w:r>
+          </w:p>
+        </w:tc>
+        <w:tc>
+          <w:tcPr>
+            <w:tcW w:type="dxa" w:w="4320"/>
+          </w:tcPr>
+          <w:p>
+            <w:r>
+              <w:t>https://dtx.innbucks.co.&lt;iso&gt; — per-cell base URL (ZW: …co.zw, KE: …co.ke, ZM: …co.zm, …)</w:t>
+            </w:r>
+          </w:p>
+        </w:tc>
+      </w:tr>
     </w:tbl>
     <w:p/>
     <w:p>

</xml_diff>